<commit_message>
sua lai ten giang vien la Chu Ba Thanh
</commit_message>
<xml_diff>
--- a/do_an_3_giam_sat_rung_dong_may.docx
+++ b/do_an_3_giam_sat_rung_dong_may.docx
@@ -143,7 +143,7 @@
                     <w:lang w:val="vi-VN"/>
                   </w:rPr>
                   <w:drawing>
-                    <wp:anchor distT="0" distB="0" distL="114300" distR="114300" simplePos="0" relativeHeight="251659264" behindDoc="0" locked="0" layoutInCell="1" allowOverlap="1" wp14:anchorId="34132054" wp14:editId="6EF570A5">
+                    <wp:anchor distT="0" distB="0" distL="114300" distR="114300" simplePos="0" relativeHeight="251659264" behindDoc="0" locked="0" layoutInCell="1" allowOverlap="1" wp14:anchorId="34132054" wp14:editId="057FD1E2">
                       <wp:simplePos x="0" y="0"/>
                       <wp:positionH relativeFrom="column">
                         <wp:posOffset>2300605</wp:posOffset>
@@ -484,6 +484,7 @@
                     <w:rFonts w:cs="Times New Roman"/>
                     <w:sz w:val="28"/>
                     <w:szCs w:val="28"/>
+                    <w:lang w:val="vi-VN"/>
                   </w:rPr>
                 </w:pPr>
                 <w:r>
@@ -544,9 +545,17 @@
                     <w:rFonts w:cs="Times New Roman"/>
                     <w:sz w:val="28"/>
                     <w:szCs w:val="28"/>
+                  </w:rPr>
+                  <w:t>Chu Bá</w:t>
+                </w:r>
+                <w:r>
+                  <w:rPr>
+                    <w:rFonts w:cs="Times New Roman"/>
+                    <w:sz w:val="28"/>
+                    <w:szCs w:val="28"/>
                     <w:lang w:val="vi-VN"/>
                   </w:rPr>
-                  <w:t>Nguyễn Đình Chiến</w:t>
+                  <w:t xml:space="preserve"> Thành</w:t>
                 </w:r>
               </w:p>
               <w:p>
@@ -9709,15 +9718,7 @@
           <w:bCs w:val="0"/>
           <w:lang w:val="vi-VN"/>
         </w:rPr>
-        <w:t>1.</w:t>
-      </w:r>
-      <w:r>
-        <w:rPr>
-          <w:rFonts w:cs="Times New Roman"/>
-          <w:bCs w:val="0"/>
-          <w:lang w:val="vi-VN"/>
-        </w:rPr>
-        <w:t>2. Mục tiêu của đề tài</w:t>
+        <w:t>1.2. Mục tiêu của đề tài</w:t>
       </w:r>
       <w:bookmarkEnd w:id="20"/>
       <w:bookmarkEnd w:id="21"/>
@@ -9974,15 +9975,7 @@
           <w:bCs w:val="0"/>
           <w:lang w:val="vi-VN"/>
         </w:rPr>
-        <w:t>1.</w:t>
-      </w:r>
-      <w:r>
-        <w:rPr>
-          <w:rFonts w:cs="Times New Roman"/>
-          <w:bCs w:val="0"/>
-          <w:lang w:val="vi-VN"/>
-        </w:rPr>
-        <w:t xml:space="preserve">3. </w:t>
+        <w:t xml:space="preserve">1.3. </w:t>
       </w:r>
       <w:bookmarkEnd w:id="24"/>
       <w:bookmarkEnd w:id="25"/>
@@ -10022,23 +10015,7 @@
           <w:bCs w:val="0"/>
           <w:lang w:val="vi-VN"/>
         </w:rPr>
-        <w:t>1.3</w:t>
-      </w:r>
-      <w:r>
-        <w:rPr>
-          <w:rFonts w:cs="Times New Roman"/>
-          <w:bCs w:val="0"/>
-          <w:lang w:val="vi-VN"/>
-        </w:rPr>
-        <w:t>.1</w:t>
-      </w:r>
-      <w:r>
-        <w:rPr>
-          <w:rFonts w:cs="Times New Roman"/>
-          <w:bCs w:val="0"/>
-          <w:lang w:val="vi-VN"/>
-        </w:rPr>
-        <w:t>. Đối tượng nghiên cứu</w:t>
+        <w:t>1.3.1. Đối tượng nghiên cứu</w:t>
       </w:r>
       <w:bookmarkEnd w:id="28"/>
     </w:p>
@@ -10180,39 +10157,7 @@
           <w:bCs w:val="0"/>
           <w:lang w:val="vi-VN"/>
         </w:rPr>
-        <w:t>1.3</w:t>
-      </w:r>
-      <w:r>
-        <w:rPr>
-          <w:rFonts w:cs="Times New Roman"/>
-          <w:bCs w:val="0"/>
-          <w:lang w:val="vi-VN"/>
-        </w:rPr>
-        <w:t>.2</w:t>
-      </w:r>
-      <w:r>
-        <w:rPr>
-          <w:rFonts w:cs="Times New Roman"/>
-          <w:bCs w:val="0"/>
-          <w:lang w:val="vi-VN"/>
-        </w:rPr>
-        <w:t xml:space="preserve">. </w:t>
-      </w:r>
-      <w:r>
-        <w:rPr>
-          <w:rFonts w:cs="Times New Roman"/>
-          <w:bCs w:val="0"/>
-          <w:lang w:val="vi-VN"/>
-        </w:rPr>
-        <w:t>P</w:t>
-      </w:r>
-      <w:r>
-        <w:rPr>
-          <w:rFonts w:cs="Times New Roman"/>
-          <w:bCs w:val="0"/>
-          <w:lang w:val="vi-VN"/>
-        </w:rPr>
-        <w:t>hạm vi nghiên cứu</w:t>
+        <w:t>1.3.2. Phạm vi nghiên cứu</w:t>
       </w:r>
       <w:bookmarkEnd w:id="29"/>
     </w:p>
@@ -10527,15 +10472,7 @@
           <w:bCs w:val="0"/>
           <w:lang w:val="vi-VN"/>
         </w:rPr>
-        <w:t>1.</w:t>
-      </w:r>
-      <w:r>
-        <w:rPr>
-          <w:rFonts w:cs="Times New Roman"/>
-          <w:bCs w:val="0"/>
-          <w:lang w:val="vi-VN"/>
-        </w:rPr>
-        <w:t xml:space="preserve">4. </w:t>
+        <w:t xml:space="preserve">1.4. </w:t>
       </w:r>
       <w:bookmarkEnd w:id="30"/>
       <w:bookmarkEnd w:id="31"/>
@@ -10754,23 +10691,7 @@
           <w:lang w:val="vi-VN"/>
         </w:rPr>
         <w:lastRenderedPageBreak/>
-        <w:t>1.</w:t>
-      </w:r>
-      <w:r>
-        <w:rPr>
-          <w:rFonts w:cs="Times New Roman"/>
-          <w:bCs w:val="0"/>
-          <w:lang w:val="vi-VN"/>
-        </w:rPr>
-        <w:t>5</w:t>
-      </w:r>
-      <w:r>
-        <w:rPr>
-          <w:rFonts w:cs="Times New Roman"/>
-          <w:bCs w:val="0"/>
-          <w:lang w:val="vi-VN"/>
-        </w:rPr>
-        <w:t xml:space="preserve">. </w:t>
+        <w:t xml:space="preserve">1.5. </w:t>
       </w:r>
       <w:r>
         <w:rPr>
@@ -10836,11 +10757,6 @@
           <w:lang w:val="vi-VN"/>
         </w:rPr>
         <w:tab/>
-      </w:r>
-      <w:r>
-        <w:rPr>
-          <w:lang w:val="vi-VN"/>
-        </w:rPr>
         <w:t>Trình bày lý do chọn đề tài, mục tiêu nghiên cứu, đối tượng và phạm vi nghiên cứu, phương pháp nghiên cứu cũng như cấu trúc của báo cáo.</w:t>
       </w:r>
     </w:p>
@@ -11063,15 +10979,7 @@
           <w:bCs w:val="0"/>
           <w:lang w:val="vi-VN"/>
         </w:rPr>
-        <w:t>2.</w:t>
-      </w:r>
-      <w:r>
-        <w:rPr>
-          <w:rFonts w:cs="Times New Roman"/>
-          <w:bCs w:val="0"/>
-          <w:lang w:val="vi-VN"/>
-        </w:rPr>
-        <w:t xml:space="preserve">1. </w:t>
+        <w:t xml:space="preserve">2.1. </w:t>
       </w:r>
       <w:bookmarkEnd w:id="38"/>
       <w:bookmarkEnd w:id="39"/>
@@ -11401,15 +11309,7 @@
           <w:bCs w:val="0"/>
           <w:lang w:val="vi-VN"/>
         </w:rPr>
-        <w:t>2.</w:t>
-      </w:r>
-      <w:r>
-        <w:rPr>
-          <w:rFonts w:cs="Times New Roman"/>
-          <w:bCs w:val="0"/>
-          <w:lang w:val="vi-VN"/>
-        </w:rPr>
-        <w:t xml:space="preserve">2. </w:t>
+        <w:t xml:space="preserve">2.2. </w:t>
       </w:r>
       <w:bookmarkEnd w:id="43"/>
       <w:bookmarkEnd w:id="44"/>
@@ -11577,23 +11477,7 @@
           <w:bCs w:val="0"/>
           <w:lang w:val="vi-VN"/>
         </w:rPr>
-        <w:t>2.2.</w:t>
-      </w:r>
-      <w:r>
-        <w:rPr>
-          <w:rFonts w:cs="Times New Roman"/>
-          <w:bCs w:val="0"/>
-          <w:lang w:val="vi-VN"/>
-        </w:rPr>
-        <w:t>1.</w:t>
-      </w:r>
-      <w:r>
-        <w:rPr>
-          <w:rFonts w:cs="Times New Roman"/>
-          <w:bCs w:val="0"/>
-          <w:lang w:val="vi-VN"/>
-        </w:rPr>
-        <w:t xml:space="preserve"> Nguyên lý hoạt động của gia tốc kế</w:t>
+        <w:t>2.2.1. Nguyên lý hoạt động của gia tốc kế</w:t>
       </w:r>
       <w:bookmarkEnd w:id="48"/>
     </w:p>
@@ -11696,72 +11580,48 @@
           <w:lang w:val="vi-VN"/>
         </w:rPr>
         <w:lastRenderedPageBreak/>
-        <w:t>2.</w:t>
-      </w:r>
-      <w:r>
+        <w:t xml:space="preserve">2.3. </w:t>
+      </w:r>
+      <w:r>
+        <w:rPr>
+          <w:lang w:val="vi-VN"/>
+        </w:rPr>
+        <w:t>Nguyên lý phát hiện rung động</w:t>
+      </w:r>
+      <w:bookmarkEnd w:id="49"/>
+    </w:p>
+    <w:p>
+      <w:pPr>
+        <w:pStyle w:val="Nidung"/>
+        <w:rPr>
+          <w:lang w:val="vi-VN"/>
+        </w:rPr>
+      </w:pPr>
+      <w:r>
+        <w:rPr>
+          <w:lang w:val="vi-VN"/>
+        </w:rPr>
+        <w:t>Rung động của hệ thống được xác định dựa trên sự thay đổi của gia tốc theo thời gian. Khi thiết bị hoạt động ổn định, giá trị gia tốc thay đổi rất nhỏ. Ngược lại, khi có rung động, sự thay đổi này sẽ tăng lên đáng kể.</w:t>
+      </w:r>
+    </w:p>
+    <w:p>
+      <w:pPr>
+        <w:pStyle w:val="Mcln"/>
+        <w:outlineLvl w:val="2"/>
         <w:rPr>
           <w:rFonts w:cs="Times New Roman"/>
           <w:bCs w:val="0"/>
           <w:lang w:val="vi-VN"/>
         </w:rPr>
-        <w:t xml:space="preserve">3. </w:t>
-      </w:r>
-      <w:r>
-        <w:rPr>
-          <w:lang w:val="vi-VN"/>
-        </w:rPr>
-        <w:t>Nguyên lý phát hiện rung động</w:t>
-      </w:r>
-      <w:bookmarkEnd w:id="49"/>
-    </w:p>
-    <w:p>
-      <w:pPr>
-        <w:pStyle w:val="Nidung"/>
-        <w:rPr>
-          <w:lang w:val="vi-VN"/>
-        </w:rPr>
-      </w:pPr>
-      <w:r>
-        <w:rPr>
-          <w:lang w:val="vi-VN"/>
-        </w:rPr>
-        <w:t>Rung động của hệ thống được xác định dựa trên sự thay đổi của gia tốc theo thời gian. Khi thiết bị hoạt động ổn định, giá trị gia tốc thay đổi rất nhỏ. Ngược lại, khi có rung động, sự thay đổi này sẽ tăng lên đáng kể.</w:t>
-      </w:r>
-    </w:p>
-    <w:p>
-      <w:pPr>
-        <w:pStyle w:val="Mcln"/>
-        <w:outlineLvl w:val="2"/>
+      </w:pPr>
+      <w:bookmarkStart w:id="50" w:name="_Toc230308159"/>
+      <w:r>
         <w:rPr>
           <w:rFonts w:cs="Times New Roman"/>
           <w:bCs w:val="0"/>
           <w:lang w:val="vi-VN"/>
         </w:rPr>
-      </w:pPr>
-      <w:bookmarkStart w:id="50" w:name="_Toc230308159"/>
-      <w:r>
-        <w:rPr>
-          <w:rFonts w:cs="Times New Roman"/>
-          <w:bCs w:val="0"/>
-          <w:lang w:val="vi-VN"/>
-        </w:rPr>
-        <w:t>2.</w:t>
-      </w:r>
-      <w:r>
-        <w:rPr>
-          <w:rFonts w:cs="Times New Roman"/>
-          <w:bCs w:val="0"/>
-          <w:lang w:val="vi-VN"/>
-        </w:rPr>
-        <w:t>3.1</w:t>
-      </w:r>
-      <w:r>
-        <w:rPr>
-          <w:rFonts w:cs="Times New Roman"/>
-          <w:bCs w:val="0"/>
-          <w:lang w:val="vi-VN"/>
-        </w:rPr>
-        <w:t>. Công thức xác định độ biến thiên gia tốc</w:t>
+        <w:t>2.3.1. Công thức xác định độ biến thiên gia tốc</w:t>
       </w:r>
       <w:bookmarkEnd w:id="50"/>
     </w:p>
@@ -12009,23 +11869,7 @@
           <w:bCs w:val="0"/>
           <w:lang w:val="vi-VN"/>
         </w:rPr>
-        <w:t>2.3.</w:t>
-      </w:r>
-      <w:r>
-        <w:rPr>
-          <w:rFonts w:cs="Times New Roman"/>
-          <w:bCs w:val="0"/>
-          <w:lang w:val="vi-VN"/>
-        </w:rPr>
-        <w:t>2</w:t>
-      </w:r>
-      <w:r>
-        <w:rPr>
-          <w:rFonts w:cs="Times New Roman"/>
-          <w:bCs w:val="0"/>
-          <w:lang w:val="vi-VN"/>
-        </w:rPr>
-        <w:t>. Phân loại mức độ rung</w:t>
+        <w:t>2.3.2. Phân loại mức độ rung</w:t>
       </w:r>
       <w:bookmarkEnd w:id="51"/>
     </w:p>
@@ -12130,23 +11974,7 @@
           <w:bCs w:val="0"/>
           <w:lang w:val="vi-VN"/>
         </w:rPr>
-        <w:t>2.3.</w:t>
-      </w:r>
-      <w:r>
-        <w:rPr>
-          <w:rFonts w:cs="Times New Roman"/>
-          <w:bCs w:val="0"/>
-          <w:lang w:val="vi-VN"/>
-        </w:rPr>
-        <w:t>3</w:t>
-      </w:r>
-      <w:r>
-        <w:rPr>
-          <w:rFonts w:cs="Times New Roman"/>
-          <w:bCs w:val="0"/>
-          <w:lang w:val="vi-VN"/>
-        </w:rPr>
-        <w:t>. Lọc nhiễu tín hiệu</w:t>
+        <w:t>2.3.3. Lọc nhiễu tín hiệu</w:t>
       </w:r>
       <w:bookmarkEnd w:id="52"/>
     </w:p>
@@ -12249,15 +12077,7 @@
           <w:lang w:val="vi-VN"/>
         </w:rPr>
         <w:lastRenderedPageBreak/>
-        <w:t>2.</w:t>
-      </w:r>
-      <w:r>
-        <w:rPr>
-          <w:rFonts w:cs="Times New Roman"/>
-          <w:bCs w:val="0"/>
-          <w:lang w:val="vi-VN"/>
-        </w:rPr>
-        <w:t xml:space="preserve">4. </w:t>
+        <w:t xml:space="preserve">2.4. </w:t>
       </w:r>
       <w:r>
         <w:rPr>
@@ -12458,15 +12278,7 @@
           <w:bCs w:val="0"/>
           <w:lang w:val="vi-VN"/>
         </w:rPr>
-        <w:t>2.</w:t>
-      </w:r>
-      <w:r>
-        <w:rPr>
-          <w:rFonts w:cs="Times New Roman"/>
-          <w:bCs w:val="0"/>
-          <w:lang w:val="vi-VN"/>
-        </w:rPr>
-        <w:t xml:space="preserve">5. </w:t>
+        <w:t xml:space="preserve">2.5. </w:t>
       </w:r>
       <w:bookmarkEnd w:id="54"/>
       <w:bookmarkEnd w:id="55"/>
@@ -12511,39 +12323,7 @@
           <w:bCs w:val="0"/>
           <w:lang w:val="vi-VN"/>
         </w:rPr>
-        <w:t>2.</w:t>
-      </w:r>
-      <w:r>
-        <w:rPr>
-          <w:rFonts w:cs="Times New Roman"/>
-          <w:bCs w:val="0"/>
-          <w:lang w:val="vi-VN"/>
-        </w:rPr>
-        <w:t>5</w:t>
-      </w:r>
-      <w:r>
-        <w:rPr>
-          <w:rFonts w:cs="Times New Roman"/>
-          <w:bCs w:val="0"/>
-          <w:lang w:val="vi-VN"/>
-        </w:rPr>
-        <w:t>.</w:t>
-      </w:r>
-      <w:r>
-        <w:rPr>
-          <w:rFonts w:cs="Times New Roman"/>
-          <w:bCs w:val="0"/>
-          <w:lang w:val="vi-VN"/>
-        </w:rPr>
-        <w:t>1</w:t>
-      </w:r>
-      <w:r>
-        <w:rPr>
-          <w:rFonts w:cs="Times New Roman"/>
-          <w:bCs w:val="0"/>
-          <w:lang w:val="vi-VN"/>
-        </w:rPr>
-        <w:t>. Mô hình hoạt động</w:t>
+        <w:t>2.5.1. Mô hình hoạt động</w:t>
       </w:r>
       <w:bookmarkEnd w:id="58"/>
     </w:p>
@@ -12800,23 +12580,7 @@
           <w:bCs w:val="0"/>
           <w:lang w:val="vi-VN"/>
         </w:rPr>
-        <w:t>2.</w:t>
-      </w:r>
-      <w:r>
-        <w:rPr>
-          <w:rFonts w:cs="Times New Roman"/>
-          <w:bCs w:val="0"/>
-          <w:lang w:val="vi-VN"/>
-        </w:rPr>
-        <w:t>6</w:t>
-      </w:r>
-      <w:r>
-        <w:rPr>
-          <w:rFonts w:cs="Times New Roman"/>
-          <w:bCs w:val="0"/>
-          <w:lang w:val="vi-VN"/>
-        </w:rPr>
-        <w:t>. Telegram Bot</w:t>
+        <w:t>2.6. Telegram Bot</w:t>
       </w:r>
       <w:bookmarkEnd w:id="60"/>
     </w:p>
@@ -12852,23 +12616,7 @@
           <w:bCs w:val="0"/>
           <w:lang w:val="vi-VN"/>
         </w:rPr>
-        <w:t>2.</w:t>
-      </w:r>
-      <w:r>
-        <w:rPr>
-          <w:rFonts w:cs="Times New Roman"/>
-          <w:bCs w:val="0"/>
-          <w:lang w:val="vi-VN"/>
-        </w:rPr>
-        <w:t>6</w:t>
-      </w:r>
-      <w:r>
-        <w:rPr>
-          <w:rFonts w:cs="Times New Roman"/>
-          <w:bCs w:val="0"/>
-          <w:lang w:val="vi-VN"/>
-        </w:rPr>
-        <w:t>.1. Nguyên lý hoạt động</w:t>
+        <w:t>2.6.1. Nguyên lý hoạt động</w:t>
       </w:r>
       <w:bookmarkEnd w:id="61"/>
     </w:p>
@@ -12942,23 +12690,7 @@
           <w:bCs w:val="0"/>
           <w:lang w:val="vi-VN"/>
         </w:rPr>
-        <w:t>2.6.</w:t>
-      </w:r>
-      <w:r>
-        <w:rPr>
-          <w:rFonts w:cs="Times New Roman"/>
-          <w:bCs w:val="0"/>
-          <w:lang w:val="vi-VN"/>
-        </w:rPr>
-        <w:t>2</w:t>
-      </w:r>
-      <w:r>
-        <w:rPr>
-          <w:rFonts w:cs="Times New Roman"/>
-          <w:bCs w:val="0"/>
-          <w:lang w:val="vi-VN"/>
-        </w:rPr>
-        <w:t>. Gửi tin nhắn bằng API</w:t>
+        <w:t>2.6.2. Gửi tin nhắn bằng API</w:t>
       </w:r>
       <w:bookmarkEnd w:id="62"/>
     </w:p>
@@ -13213,23 +12945,7 @@
           <w:lang w:val="vi-VN"/>
         </w:rPr>
         <w:lastRenderedPageBreak/>
-        <w:t>2.6.</w:t>
-      </w:r>
-      <w:r>
-        <w:rPr>
-          <w:rFonts w:cs="Times New Roman"/>
-          <w:bCs w:val="0"/>
-          <w:lang w:val="vi-VN"/>
-        </w:rPr>
-        <w:t>3</w:t>
-      </w:r>
-      <w:r>
-        <w:rPr>
-          <w:rFonts w:cs="Times New Roman"/>
-          <w:bCs w:val="0"/>
-          <w:lang w:val="vi-VN"/>
-        </w:rPr>
-        <w:t>. Ứng dụng trong đề tài</w:t>
+        <w:t>2.6.3. Ứng dụng trong đề tài</w:t>
       </w:r>
       <w:bookmarkEnd w:id="64"/>
     </w:p>
@@ -13318,23 +13034,7 @@
           <w:bCs w:val="0"/>
           <w:lang w:val="vi-VN"/>
         </w:rPr>
-        <w:t>2.</w:t>
-      </w:r>
-      <w:r>
-        <w:rPr>
-          <w:rFonts w:cs="Times New Roman"/>
-          <w:bCs w:val="0"/>
-          <w:lang w:val="vi-VN"/>
-        </w:rPr>
-        <w:t>7</w:t>
-      </w:r>
-      <w:r>
-        <w:rPr>
-          <w:rFonts w:cs="Times New Roman"/>
-          <w:bCs w:val="0"/>
-          <w:lang w:val="vi-VN"/>
-        </w:rPr>
-        <w:t>. Hệ thống cảnh báo</w:t>
+        <w:t>2.7. Hệ thống cảnh báo</w:t>
       </w:r>
       <w:bookmarkEnd w:id="65"/>
     </w:p>
@@ -13408,39 +13108,7 @@
           <w:bCs w:val="0"/>
           <w:lang w:val="vi-VN"/>
         </w:rPr>
-        <w:t>2.</w:t>
-      </w:r>
-      <w:r>
-        <w:rPr>
-          <w:rFonts w:cs="Times New Roman"/>
-          <w:bCs w:val="0"/>
-          <w:lang w:val="vi-VN"/>
-        </w:rPr>
-        <w:t>7</w:t>
-      </w:r>
-      <w:r>
-        <w:rPr>
-          <w:rFonts w:cs="Times New Roman"/>
-          <w:bCs w:val="0"/>
-          <w:lang w:val="vi-VN"/>
-        </w:rPr>
-        <w:t>.</w:t>
-      </w:r>
-      <w:r>
-        <w:rPr>
-          <w:rFonts w:cs="Times New Roman"/>
-          <w:bCs w:val="0"/>
-          <w:lang w:val="vi-VN"/>
-        </w:rPr>
-        <w:t>1</w:t>
-      </w:r>
-      <w:r>
-        <w:rPr>
-          <w:rFonts w:cs="Times New Roman"/>
-          <w:bCs w:val="0"/>
-          <w:lang w:val="vi-VN"/>
-        </w:rPr>
-        <w:t>. LED</w:t>
+        <w:t>2.7.1. LED</w:t>
       </w:r>
       <w:bookmarkEnd w:id="66"/>
     </w:p>
@@ -13606,23 +13274,7 @@
           <w:lang w:val="vi-VN"/>
         </w:rPr>
         <w:lastRenderedPageBreak/>
-        <w:t>2.7.</w:t>
-      </w:r>
-      <w:r>
-        <w:rPr>
-          <w:rFonts w:cs="Times New Roman"/>
-          <w:bCs w:val="0"/>
-          <w:lang w:val="vi-VN"/>
-        </w:rPr>
-        <w:t>2</w:t>
-      </w:r>
-      <w:r>
-        <w:rPr>
-          <w:rFonts w:cs="Times New Roman"/>
-          <w:bCs w:val="0"/>
-          <w:lang w:val="vi-VN"/>
-        </w:rPr>
-        <w:t>. Buzzer</w:t>
+        <w:t>2.7.2. Buzzer</w:t>
       </w:r>
       <w:bookmarkEnd w:id="68"/>
     </w:p>
@@ -13815,15 +13467,7 @@
           <w:bCs w:val="0"/>
           <w:lang w:val="vi-VN"/>
         </w:rPr>
-        <w:t>3.</w:t>
-      </w:r>
-      <w:r>
-        <w:rPr>
-          <w:rFonts w:cs="Times New Roman"/>
-          <w:bCs w:val="0"/>
-          <w:lang w:val="vi-VN"/>
-        </w:rPr>
-        <w:t xml:space="preserve">1. </w:t>
+        <w:t xml:space="preserve">3.1. </w:t>
       </w:r>
       <w:bookmarkEnd w:id="73"/>
       <w:bookmarkEnd w:id="74"/>
@@ -13856,47 +13500,7 @@
           <w:bCs w:val="0"/>
           <w:lang w:val="vi-VN"/>
         </w:rPr>
-        <w:t>3</w:t>
-      </w:r>
-      <w:r>
-        <w:rPr>
-          <w:rFonts w:cs="Times New Roman"/>
-          <w:bCs w:val="0"/>
-          <w:lang w:val="vi-VN"/>
-        </w:rPr>
-        <w:t>.</w:t>
-      </w:r>
-      <w:r>
-        <w:rPr>
-          <w:rFonts w:cs="Times New Roman"/>
-          <w:bCs w:val="0"/>
-          <w:lang w:val="vi-VN"/>
-        </w:rPr>
-        <w:t>1</w:t>
-      </w:r>
-      <w:r>
-        <w:rPr>
-          <w:rFonts w:cs="Times New Roman"/>
-          <w:bCs w:val="0"/>
-          <w:lang w:val="vi-VN"/>
-        </w:rPr>
-        <w:t>.</w:t>
-      </w:r>
-      <w:r>
-        <w:rPr>
-          <w:rFonts w:cs="Times New Roman"/>
-          <w:bCs w:val="0"/>
-          <w:lang w:val="vi-VN"/>
-        </w:rPr>
-        <w:t>1</w:t>
-      </w:r>
-      <w:r>
-        <w:rPr>
-          <w:rFonts w:cs="Times New Roman"/>
-          <w:bCs w:val="0"/>
-          <w:lang w:val="vi-VN"/>
-        </w:rPr>
-        <w:t>. Yêu cầu chức năng</w:t>
+        <w:t>3.1.1. Yêu cầu chức năng</w:t>
       </w:r>
       <w:bookmarkEnd w:id="77"/>
     </w:p>
@@ -14130,23 +13734,7 @@
           <w:bCs w:val="0"/>
           <w:lang w:val="vi-VN"/>
         </w:rPr>
-        <w:t>3.1.</w:t>
-      </w:r>
-      <w:r>
-        <w:rPr>
-          <w:rFonts w:cs="Times New Roman"/>
-          <w:bCs w:val="0"/>
-          <w:lang w:val="vi-VN"/>
-        </w:rPr>
-        <w:t>2</w:t>
-      </w:r>
-      <w:r>
-        <w:rPr>
-          <w:rFonts w:cs="Times New Roman"/>
-          <w:bCs w:val="0"/>
-          <w:lang w:val="vi-VN"/>
-        </w:rPr>
-        <w:t>. Yêu cầu phi chức năng</w:t>
+        <w:t>3.1.2. Yêu cầu phi chức năng</w:t>
       </w:r>
       <w:bookmarkEnd w:id="78"/>
     </w:p>
@@ -14272,23 +13860,7 @@
           <w:lang w:val="vi-VN"/>
         </w:rPr>
         <w:lastRenderedPageBreak/>
-        <w:t>3.</w:t>
-      </w:r>
-      <w:r>
-        <w:rPr>
-          <w:rFonts w:cs="Times New Roman"/>
-          <w:bCs w:val="0"/>
-          <w:lang w:val="vi-VN"/>
-        </w:rPr>
-        <w:t>2</w:t>
-      </w:r>
-      <w:r>
-        <w:rPr>
-          <w:rFonts w:cs="Times New Roman"/>
-          <w:bCs w:val="0"/>
-          <w:lang w:val="vi-VN"/>
-        </w:rPr>
-        <w:t>. Thiết kế tổng thể hệ thống</w:t>
+        <w:t>3.2. Thiết kế tổng thể hệ thống</w:t>
       </w:r>
       <w:bookmarkEnd w:id="79"/>
     </w:p>
@@ -14310,39 +13882,7 @@
           <w:bCs w:val="0"/>
           <w:lang w:val="vi-VN"/>
         </w:rPr>
-        <w:t>3.</w:t>
-      </w:r>
-      <w:r>
-        <w:rPr>
-          <w:rFonts w:cs="Times New Roman"/>
-          <w:bCs w:val="0"/>
-          <w:lang w:val="vi-VN"/>
-        </w:rPr>
-        <w:t>2</w:t>
-      </w:r>
-      <w:r>
-        <w:rPr>
-          <w:rFonts w:cs="Times New Roman"/>
-          <w:bCs w:val="0"/>
-          <w:lang w:val="vi-VN"/>
-        </w:rPr>
-        <w:t>.</w:t>
-      </w:r>
-      <w:r>
-        <w:rPr>
-          <w:rFonts w:cs="Times New Roman"/>
-          <w:bCs w:val="0"/>
-          <w:lang w:val="vi-VN"/>
-        </w:rPr>
-        <w:t>1</w:t>
-      </w:r>
-      <w:r>
-        <w:rPr>
-          <w:rFonts w:cs="Times New Roman"/>
-          <w:bCs w:val="0"/>
-          <w:lang w:val="vi-VN"/>
-        </w:rPr>
-        <w:t>. Sơ đồ khối hệ thống</w:t>
+        <w:t>3.2.1. Sơ đồ khối hệ thống</w:t>
       </w:r>
       <w:bookmarkEnd w:id="80"/>
     </w:p>
@@ -14591,23 +14131,7 @@
           <w:bCs w:val="0"/>
           <w:lang w:val="vi-VN"/>
         </w:rPr>
-        <w:t>3.2.</w:t>
-      </w:r>
-      <w:r>
-        <w:rPr>
-          <w:rFonts w:cs="Times New Roman"/>
-          <w:bCs w:val="0"/>
-          <w:lang w:val="vi-VN"/>
-        </w:rPr>
-        <w:t>2</w:t>
-      </w:r>
-      <w:r>
-        <w:rPr>
-          <w:rFonts w:cs="Times New Roman"/>
-          <w:bCs w:val="0"/>
-          <w:lang w:val="vi-VN"/>
-        </w:rPr>
-        <w:t>. Nguyên lý hoạt động hệ thống</w:t>
+        <w:t>3.2.2. Nguyên lý hoạt động hệ thống</w:t>
       </w:r>
       <w:bookmarkEnd w:id="81"/>
     </w:p>
@@ -14794,39 +14318,7 @@
           <w:bCs w:val="0"/>
           <w:lang w:val="vi-VN"/>
         </w:rPr>
-        <w:t>3.</w:t>
-      </w:r>
-      <w:r>
-        <w:rPr>
-          <w:rFonts w:cs="Times New Roman"/>
-          <w:bCs w:val="0"/>
-          <w:lang w:val="vi-VN"/>
-        </w:rPr>
-        <w:t>3</w:t>
-      </w:r>
-      <w:r>
-        <w:rPr>
-          <w:rFonts w:cs="Times New Roman"/>
-          <w:bCs w:val="0"/>
-          <w:lang w:val="vi-VN"/>
-        </w:rPr>
-        <w:t>.</w:t>
-      </w:r>
-      <w:r>
-        <w:rPr>
-          <w:rFonts w:cs="Times New Roman"/>
-          <w:bCs w:val="0"/>
-          <w:lang w:val="vi-VN"/>
-        </w:rPr>
-        <w:t>1</w:t>
-      </w:r>
-      <w:r>
-        <w:rPr>
-          <w:rFonts w:cs="Times New Roman"/>
-          <w:bCs w:val="0"/>
-          <w:lang w:val="vi-VN"/>
-        </w:rPr>
-        <w:t>. Vi điều khiển ESP32</w:t>
+        <w:t>3.3.1. Vi điều khiển ESP32</w:t>
       </w:r>
       <w:bookmarkEnd w:id="83"/>
     </w:p>
@@ -14934,23 +14426,7 @@
           <w:bCs w:val="0"/>
           <w:lang w:val="vi-VN"/>
         </w:rPr>
-        <w:t>3.3.</w:t>
-      </w:r>
-      <w:r>
-        <w:rPr>
-          <w:rFonts w:cs="Times New Roman"/>
-          <w:bCs w:val="0"/>
-          <w:lang w:val="vi-VN"/>
-        </w:rPr>
-        <w:t>2</w:t>
-      </w:r>
-      <w:r>
-        <w:rPr>
-          <w:rFonts w:cs="Times New Roman"/>
-          <w:bCs w:val="0"/>
-          <w:lang w:val="vi-VN"/>
-        </w:rPr>
-        <w:t>. Kết nối cảm biến MPU6050</w:t>
+        <w:t>3.3.2. Kết nối cảm biến MPU6050</w:t>
       </w:r>
       <w:bookmarkEnd w:id="84"/>
     </w:p>
@@ -15062,23 +14538,7 @@
           <w:bCs w:val="0"/>
           <w:lang w:val="vi-VN"/>
         </w:rPr>
-        <w:t>3.3.</w:t>
-      </w:r>
-      <w:r>
-        <w:rPr>
-          <w:rFonts w:cs="Times New Roman"/>
-          <w:bCs w:val="0"/>
-          <w:lang w:val="vi-VN"/>
-        </w:rPr>
-        <w:t>3</w:t>
-      </w:r>
-      <w:r>
-        <w:rPr>
-          <w:rFonts w:cs="Times New Roman"/>
-          <w:bCs w:val="0"/>
-          <w:lang w:val="vi-VN"/>
-        </w:rPr>
-        <w:t>. Kết nối hệ thống cảnh báo</w:t>
+        <w:t>3.3.3. Kết nối hệ thống cảnh báo</w:t>
       </w:r>
       <w:bookmarkEnd w:id="85"/>
     </w:p>
@@ -15186,23 +14646,7 @@
           <w:bCs w:val="0"/>
           <w:lang w:val="vi-VN"/>
         </w:rPr>
-        <w:t>3.3.</w:t>
-      </w:r>
-      <w:r>
-        <w:rPr>
-          <w:rFonts w:cs="Times New Roman"/>
-          <w:bCs w:val="0"/>
-          <w:lang w:val="vi-VN"/>
-        </w:rPr>
-        <w:t>4</w:t>
-      </w:r>
-      <w:r>
-        <w:rPr>
-          <w:rFonts w:cs="Times New Roman"/>
-          <w:bCs w:val="0"/>
-          <w:lang w:val="vi-VN"/>
-        </w:rPr>
-        <w:t>. Nguồn cấp</w:t>
+        <w:t>3.3.4. Nguồn cấp</w:t>
       </w:r>
       <w:bookmarkEnd w:id="86"/>
     </w:p>
@@ -15289,23 +14733,7 @@
           <w:lang w:val="vi-VN"/>
         </w:rPr>
         <w:lastRenderedPageBreak/>
-        <w:t>3.</w:t>
-      </w:r>
-      <w:r>
-        <w:rPr>
-          <w:rFonts w:cs="Times New Roman"/>
-          <w:bCs w:val="0"/>
-          <w:lang w:val="vi-VN"/>
-        </w:rPr>
-        <w:t>4</w:t>
-      </w:r>
-      <w:r>
-        <w:rPr>
-          <w:rFonts w:cs="Times New Roman"/>
-          <w:bCs w:val="0"/>
-          <w:lang w:val="vi-VN"/>
-        </w:rPr>
-        <w:t>. Thiết kế phần mềm</w:t>
+        <w:t>3.4. Thiết kế phần mềm</w:t>
       </w:r>
       <w:bookmarkEnd w:id="87"/>
     </w:p>
@@ -15327,39 +14755,7 @@
           <w:bCs w:val="0"/>
           <w:lang w:val="vi-VN"/>
         </w:rPr>
-        <w:t>3.</w:t>
-      </w:r>
-      <w:r>
-        <w:rPr>
-          <w:rFonts w:cs="Times New Roman"/>
-          <w:bCs w:val="0"/>
-          <w:lang w:val="vi-VN"/>
-        </w:rPr>
-        <w:t>4</w:t>
-      </w:r>
-      <w:r>
-        <w:rPr>
-          <w:rFonts w:cs="Times New Roman"/>
-          <w:bCs w:val="0"/>
-          <w:lang w:val="vi-VN"/>
-        </w:rPr>
-        <w:t>.</w:t>
-      </w:r>
-      <w:r>
-        <w:rPr>
-          <w:rFonts w:cs="Times New Roman"/>
-          <w:bCs w:val="0"/>
-          <w:lang w:val="vi-VN"/>
-        </w:rPr>
-        <w:t>1</w:t>
-      </w:r>
-      <w:r>
-        <w:rPr>
-          <w:rFonts w:cs="Times New Roman"/>
-          <w:bCs w:val="0"/>
-          <w:lang w:val="vi-VN"/>
-        </w:rPr>
-        <w:t>. Lưu đồ thuật toán</w:t>
+        <w:t>3.4.1. Lưu đồ thuật toán</w:t>
       </w:r>
       <w:bookmarkEnd w:id="88"/>
     </w:p>
@@ -15557,23 +14953,7 @@
           <w:bCs w:val="0"/>
           <w:lang w:val="vi-VN"/>
         </w:rPr>
-        <w:t>3.4.</w:t>
-      </w:r>
-      <w:r>
-        <w:rPr>
-          <w:rFonts w:cs="Times New Roman"/>
-          <w:bCs w:val="0"/>
-          <w:lang w:val="vi-VN"/>
-        </w:rPr>
-        <w:t>2</w:t>
-      </w:r>
-      <w:r>
-        <w:rPr>
-          <w:rFonts w:cs="Times New Roman"/>
-          <w:bCs w:val="0"/>
-          <w:lang w:val="vi-VN"/>
-        </w:rPr>
-        <w:t>. Thuật toán phát hiện rung</w:t>
+        <w:t>3.4.2. Thuật toán phát hiện rung</w:t>
       </w:r>
       <w:bookmarkEnd w:id="89"/>
     </w:p>
@@ -15793,23 +15173,7 @@
           <w:bCs w:val="0"/>
           <w:lang w:val="vi-VN"/>
         </w:rPr>
-        <w:t>3.4.</w:t>
-      </w:r>
-      <w:r>
-        <w:rPr>
-          <w:rFonts w:cs="Times New Roman"/>
-          <w:bCs w:val="0"/>
-          <w:lang w:val="vi-VN"/>
-        </w:rPr>
-        <w:t>3</w:t>
-      </w:r>
-      <w:r>
-        <w:rPr>
-          <w:rFonts w:cs="Times New Roman"/>
-          <w:bCs w:val="0"/>
-          <w:lang w:val="vi-VN"/>
-        </w:rPr>
-        <w:t>. Lọc nhiễu tín hiệu</w:t>
+        <w:t>3.4.3. Lọc nhiễu tín hiệu</w:t>
       </w:r>
       <w:bookmarkEnd w:id="90"/>
     </w:p>
@@ -15897,23 +15261,7 @@
           <w:lang w:val="vi-VN"/>
         </w:rPr>
         <w:lastRenderedPageBreak/>
-        <w:t>3.4.</w:t>
-      </w:r>
-      <w:r>
-        <w:rPr>
-          <w:rFonts w:cs="Times New Roman"/>
-          <w:bCs w:val="0"/>
-          <w:lang w:val="vi-VN"/>
-        </w:rPr>
-        <w:t>4.</w:t>
-      </w:r>
-      <w:r>
-        <w:rPr>
-          <w:rFonts w:cs="Times New Roman"/>
-          <w:bCs w:val="0"/>
-          <w:lang w:val="vi-VN"/>
-        </w:rPr>
-        <w:t xml:space="preserve"> Điều khiển LED và buzzer</w:t>
+        <w:t>3.4.4. Điều khiển LED và buzzer</w:t>
       </w:r>
       <w:bookmarkEnd w:id="91"/>
     </w:p>
@@ -16080,23 +15428,7 @@
           <w:bCs w:val="0"/>
           <w:lang w:val="vi-VN"/>
         </w:rPr>
-        <w:t>3.4.</w:t>
-      </w:r>
-      <w:r>
-        <w:rPr>
-          <w:rFonts w:cs="Times New Roman"/>
-          <w:bCs w:val="0"/>
-          <w:lang w:val="vi-VN"/>
-        </w:rPr>
-        <w:t>5</w:t>
-      </w:r>
-      <w:r>
-        <w:rPr>
-          <w:rFonts w:cs="Times New Roman"/>
-          <w:bCs w:val="0"/>
-          <w:lang w:val="vi-VN"/>
-        </w:rPr>
-        <w:t>. Kết nối WiFi và MQTT</w:t>
+        <w:t>3.4.5. Kết nối WiFi và MQTT</w:t>
       </w:r>
       <w:bookmarkEnd w:id="92"/>
     </w:p>
@@ -16265,23 +15597,7 @@
           <w:lang w:val="vi-VN"/>
         </w:rPr>
         <w:lastRenderedPageBreak/>
-        <w:t>3.4.</w:t>
-      </w:r>
-      <w:r>
-        <w:rPr>
-          <w:rFonts w:cs="Times New Roman"/>
-          <w:bCs w:val="0"/>
-          <w:lang w:val="vi-VN"/>
-        </w:rPr>
-        <w:t>6</w:t>
-      </w:r>
-      <w:r>
-        <w:rPr>
-          <w:rFonts w:cs="Times New Roman"/>
-          <w:bCs w:val="0"/>
-          <w:lang w:val="vi-VN"/>
-        </w:rPr>
-        <w:t>. Gửi cảnh báo Telegram</w:t>
+        <w:t>3.4.6. Gửi cảnh báo Telegram</w:t>
       </w:r>
       <w:bookmarkEnd w:id="93"/>
     </w:p>
@@ -16496,23 +15812,7 @@
           <w:lang w:val="vi-VN"/>
         </w:rPr>
         <w:lastRenderedPageBreak/>
-        <w:t>3.</w:t>
-      </w:r>
-      <w:r>
-        <w:rPr>
-          <w:rFonts w:cs="Times New Roman"/>
-          <w:bCs w:val="0"/>
-          <w:lang w:val="vi-VN"/>
-        </w:rPr>
-        <w:t>5</w:t>
-      </w:r>
-      <w:r>
-        <w:rPr>
-          <w:rFonts w:cs="Times New Roman"/>
-          <w:bCs w:val="0"/>
-          <w:lang w:val="vi-VN"/>
-        </w:rPr>
-        <w:t>. Thiết kế dữ liệu và giao tiếp</w:t>
+        <w:t>3.5. Thiết kế dữ liệu và giao tiếp</w:t>
       </w:r>
       <w:bookmarkEnd w:id="95"/>
     </w:p>
@@ -16534,39 +15834,7 @@
           <w:bCs w:val="0"/>
           <w:lang w:val="vi-VN"/>
         </w:rPr>
-        <w:t>3.</w:t>
-      </w:r>
-      <w:r>
-        <w:rPr>
-          <w:rFonts w:cs="Times New Roman"/>
-          <w:bCs w:val="0"/>
-          <w:lang w:val="vi-VN"/>
-        </w:rPr>
-        <w:t>5</w:t>
-      </w:r>
-      <w:r>
-        <w:rPr>
-          <w:rFonts w:cs="Times New Roman"/>
-          <w:bCs w:val="0"/>
-          <w:lang w:val="vi-VN"/>
-        </w:rPr>
-        <w:t>.</w:t>
-      </w:r>
-      <w:r>
-        <w:rPr>
-          <w:rFonts w:cs="Times New Roman"/>
-          <w:bCs w:val="0"/>
-          <w:lang w:val="vi-VN"/>
-        </w:rPr>
-        <w:t>1</w:t>
-      </w:r>
-      <w:r>
-        <w:rPr>
-          <w:rFonts w:cs="Times New Roman"/>
-          <w:bCs w:val="0"/>
-          <w:lang w:val="vi-VN"/>
-        </w:rPr>
-        <w:t>. Dữ liệu gửi MQTT</w:t>
+        <w:t>3.5.1. Dữ liệu gửi MQTT</w:t>
       </w:r>
       <w:bookmarkEnd w:id="96"/>
     </w:p>
@@ -16700,7 +15968,6 @@
         </w:rPr>
         <w:t xml:space="preserve">: Dữ liệu được publish về giao diện điều khiển </w:t>
       </w:r>
-      <w:proofErr w:type="spellStart"/>
       <w:r>
         <w:rPr>
           <w:b w:val="0"/>
@@ -16708,7 +15975,6 @@
         </w:rPr>
         <w:t>để</w:t>
       </w:r>
-      <w:proofErr w:type="spellEnd"/>
       <w:r>
         <w:rPr>
           <w:b w:val="0"/>
@@ -16737,23 +16003,7 @@
           <w:bCs w:val="0"/>
           <w:lang w:val="vi-VN"/>
         </w:rPr>
-        <w:t>3.5.</w:t>
-      </w:r>
-      <w:r>
-        <w:rPr>
-          <w:rFonts w:cs="Times New Roman"/>
-          <w:bCs w:val="0"/>
-          <w:lang w:val="vi-VN"/>
-        </w:rPr>
-        <w:t>2</w:t>
-      </w:r>
-      <w:r>
-        <w:rPr>
-          <w:rFonts w:cs="Times New Roman"/>
-          <w:bCs w:val="0"/>
-          <w:lang w:val="vi-VN"/>
-        </w:rPr>
-        <w:t>. Giao tiếp điều khiển</w:t>
+        <w:t>3.5.2. Giao tiếp điều khiển</w:t>
       </w:r>
       <w:bookmarkEnd w:id="98"/>
     </w:p>
@@ -16823,23 +16073,7 @@
           <w:lang w:val="vi-VN"/>
         </w:rPr>
         <w:lastRenderedPageBreak/>
-        <w:t>3.</w:t>
-      </w:r>
-      <w:r>
-        <w:rPr>
-          <w:rFonts w:cs="Times New Roman"/>
-          <w:bCs w:val="0"/>
-          <w:lang w:val="vi-VN"/>
-        </w:rPr>
-        <w:t>6</w:t>
-      </w:r>
-      <w:r>
-        <w:rPr>
-          <w:rFonts w:cs="Times New Roman"/>
-          <w:bCs w:val="0"/>
-          <w:lang w:val="vi-VN"/>
-        </w:rPr>
-        <w:t xml:space="preserve">. </w:t>
+        <w:t xml:space="preserve">3.6. </w:t>
       </w:r>
       <w:r>
         <w:rPr>
@@ -16860,13 +16094,7 @@
         <w:rPr>
           <w:lang w:val="vi-VN"/>
         </w:rPr>
-        <w:t>Ưu điểm</w:t>
-      </w:r>
-      <w:r>
-        <w:rPr>
-          <w:lang w:val="vi-VN"/>
-        </w:rPr>
-        <w:t>:</w:t>
+        <w:t>Ưu điểm:</w:t>
       </w:r>
     </w:p>
     <w:p>
@@ -16953,13 +16181,7 @@
         <w:rPr>
           <w:lang w:val="vi-VN"/>
         </w:rPr>
-        <w:t>Hạn chế</w:t>
-      </w:r>
-      <w:r>
-        <w:rPr>
-          <w:lang w:val="vi-VN"/>
-        </w:rPr>
-        <w:t>:</w:t>
+        <w:t>Hạn chế:</w:t>
       </w:r>
     </w:p>
     <w:p>
@@ -17139,15 +16361,7 @@
           <w:bCs w:val="0"/>
           <w:lang w:val="vi-VN"/>
         </w:rPr>
-        <w:t>4.</w:t>
-      </w:r>
-      <w:r>
-        <w:rPr>
-          <w:rFonts w:cs="Times New Roman"/>
-          <w:bCs w:val="0"/>
-          <w:lang w:val="vi-VN"/>
-        </w:rPr>
-        <w:t xml:space="preserve">1. </w:t>
+        <w:t xml:space="preserve">4.1. </w:t>
       </w:r>
       <w:bookmarkEnd w:id="103"/>
       <w:bookmarkEnd w:id="104"/>
@@ -17342,15 +16556,7 @@
           <w:bCs w:val="0"/>
           <w:lang w:val="vi-VN"/>
         </w:rPr>
-        <w:t>4.</w:t>
-      </w:r>
-      <w:r>
-        <w:rPr>
-          <w:rFonts w:cs="Times New Roman"/>
-          <w:bCs w:val="0"/>
-          <w:lang w:val="vi-VN"/>
-        </w:rPr>
-        <w:t xml:space="preserve">2. </w:t>
+        <w:t xml:space="preserve">4.2. </w:t>
       </w:r>
       <w:bookmarkEnd w:id="107"/>
       <w:bookmarkEnd w:id="108"/>
@@ -17381,47 +16587,7 @@
           <w:bCs w:val="0"/>
           <w:lang w:val="vi-VN"/>
         </w:rPr>
-        <w:t>4</w:t>
-      </w:r>
-      <w:r>
-        <w:rPr>
-          <w:rFonts w:cs="Times New Roman"/>
-          <w:bCs w:val="0"/>
-          <w:lang w:val="vi-VN"/>
-        </w:rPr>
-        <w:t>.</w:t>
-      </w:r>
-      <w:r>
-        <w:rPr>
-          <w:rFonts w:cs="Times New Roman"/>
-          <w:bCs w:val="0"/>
-          <w:lang w:val="vi-VN"/>
-        </w:rPr>
-        <w:t>2</w:t>
-      </w:r>
-      <w:r>
-        <w:rPr>
-          <w:rFonts w:cs="Times New Roman"/>
-          <w:bCs w:val="0"/>
-          <w:lang w:val="vi-VN"/>
-        </w:rPr>
-        <w:t>.</w:t>
-      </w:r>
-      <w:r>
-        <w:rPr>
-          <w:rFonts w:cs="Times New Roman"/>
-          <w:bCs w:val="0"/>
-          <w:lang w:val="vi-VN"/>
-        </w:rPr>
-        <w:t>1</w:t>
-      </w:r>
-      <w:r>
-        <w:rPr>
-          <w:rFonts w:cs="Times New Roman"/>
-          <w:bCs w:val="0"/>
-          <w:lang w:val="vi-VN"/>
-        </w:rPr>
-        <w:t>. Lắp ráp phần cứng</w:t>
+        <w:t>4.2.1. Lắp ráp phần cứng</w:t>
       </w:r>
       <w:bookmarkEnd w:id="111"/>
     </w:p>
@@ -17514,23 +16680,7 @@
           <w:bCs w:val="0"/>
           <w:lang w:val="vi-VN"/>
         </w:rPr>
-        <w:t>4.2.</w:t>
-      </w:r>
-      <w:r>
-        <w:rPr>
-          <w:rFonts w:cs="Times New Roman"/>
-          <w:bCs w:val="0"/>
-          <w:lang w:val="vi-VN"/>
-        </w:rPr>
-        <w:t>2</w:t>
-      </w:r>
-      <w:r>
-        <w:rPr>
-          <w:rFonts w:cs="Times New Roman"/>
-          <w:bCs w:val="0"/>
-          <w:lang w:val="vi-VN"/>
-        </w:rPr>
-        <w:t>. Nạp chương trình</w:t>
+        <w:t>4.2.2. Nạp chương trình</w:t>
       </w:r>
       <w:bookmarkEnd w:id="112"/>
     </w:p>
@@ -17638,23 +16788,7 @@
           <w:lang w:val="vi-VN"/>
         </w:rPr>
         <w:lastRenderedPageBreak/>
-        <w:t>4.2.</w:t>
-      </w:r>
-      <w:r>
-        <w:rPr>
-          <w:rFonts w:cs="Times New Roman"/>
-          <w:bCs w:val="0"/>
-          <w:lang w:val="vi-VN"/>
-        </w:rPr>
-        <w:t>3</w:t>
-      </w:r>
-      <w:r>
-        <w:rPr>
-          <w:rFonts w:cs="Times New Roman"/>
-          <w:bCs w:val="0"/>
-          <w:lang w:val="vi-VN"/>
-        </w:rPr>
-        <w:t>. Kiểm tra kết nối hệ thống</w:t>
+        <w:t>4.2.3. Kiểm tra kết nối hệ thống</w:t>
       </w:r>
       <w:bookmarkEnd w:id="113"/>
     </w:p>
@@ -17762,15 +16896,7 @@
           <w:bCs w:val="0"/>
           <w:lang w:val="vi-VN"/>
         </w:rPr>
-        <w:t>4.</w:t>
-      </w:r>
-      <w:r>
-        <w:rPr>
-          <w:rFonts w:cs="Times New Roman"/>
-          <w:bCs w:val="0"/>
-          <w:lang w:val="vi-VN"/>
-        </w:rPr>
-        <w:t xml:space="preserve">3. </w:t>
+        <w:t xml:space="preserve">4.3. </w:t>
       </w:r>
       <w:bookmarkEnd w:id="114"/>
       <w:bookmarkEnd w:id="115"/>
@@ -17801,39 +16927,7 @@
           <w:bCs w:val="0"/>
           <w:lang w:val="vi-VN"/>
         </w:rPr>
-        <w:t>4.</w:t>
-      </w:r>
-      <w:r>
-        <w:rPr>
-          <w:rFonts w:cs="Times New Roman"/>
-          <w:bCs w:val="0"/>
-          <w:lang w:val="vi-VN"/>
-        </w:rPr>
-        <w:t>3</w:t>
-      </w:r>
-      <w:r>
-        <w:rPr>
-          <w:rFonts w:cs="Times New Roman"/>
-          <w:bCs w:val="0"/>
-          <w:lang w:val="vi-VN"/>
-        </w:rPr>
-        <w:t>.</w:t>
-      </w:r>
-      <w:r>
-        <w:rPr>
-          <w:rFonts w:cs="Times New Roman"/>
-          <w:bCs w:val="0"/>
-          <w:lang w:val="vi-VN"/>
-        </w:rPr>
-        <w:t>1</w:t>
-      </w:r>
-      <w:r>
-        <w:rPr>
-          <w:rFonts w:cs="Times New Roman"/>
-          <w:bCs w:val="0"/>
-          <w:lang w:val="vi-VN"/>
-        </w:rPr>
-        <w:t>. Trạng thái bình thường</w:t>
+        <w:t>4.3.1. Trạng thái bình thường</w:t>
       </w:r>
       <w:bookmarkEnd w:id="118"/>
     </w:p>
@@ -17941,23 +17035,7 @@
           <w:bCs w:val="0"/>
           <w:lang w:val="vi-VN"/>
         </w:rPr>
-        <w:t>4.3.</w:t>
-      </w:r>
-      <w:r>
-        <w:rPr>
-          <w:rFonts w:cs="Times New Roman"/>
-          <w:bCs w:val="0"/>
-          <w:lang w:val="vi-VN"/>
-        </w:rPr>
-        <w:t>2</w:t>
-      </w:r>
-      <w:r>
-        <w:rPr>
-          <w:rFonts w:cs="Times New Roman"/>
-          <w:bCs w:val="0"/>
-          <w:lang w:val="vi-VN"/>
-        </w:rPr>
-        <w:t>. Trạng thái rung nhẹ</w:t>
+        <w:t>4.3.2. Trạng thái rung nhẹ</w:t>
       </w:r>
       <w:bookmarkEnd w:id="119"/>
     </w:p>
@@ -18065,23 +17143,7 @@
           <w:bCs w:val="0"/>
           <w:lang w:val="vi-VN"/>
         </w:rPr>
-        <w:t>4.3.</w:t>
-      </w:r>
-      <w:r>
-        <w:rPr>
-          <w:rFonts w:cs="Times New Roman"/>
-          <w:bCs w:val="0"/>
-          <w:lang w:val="vi-VN"/>
-        </w:rPr>
-        <w:t>3</w:t>
-      </w:r>
-      <w:r>
-        <w:rPr>
-          <w:rFonts w:cs="Times New Roman"/>
-          <w:bCs w:val="0"/>
-          <w:lang w:val="vi-VN"/>
-        </w:rPr>
-        <w:t>. Trạng thái rung mạnh</w:t>
+        <w:t>4.3.3. Trạng thái rung mạnh</w:t>
       </w:r>
       <w:bookmarkEnd w:id="120"/>
     </w:p>
@@ -18151,13 +17213,7 @@
           <w:lang w:val="vi-VN"/>
         </w:rPr>
         <w:lastRenderedPageBreak/>
-        <w:t xml:space="preserve">Telegram gửi thông báo đến người </w:t>
-      </w:r>
-      <w:r>
-        <w:rPr>
-          <w:lang w:val="vi-VN"/>
-        </w:rPr>
-        <w:t>dung</w:t>
+        <w:t>Telegram gửi thông báo đến người dung</w:t>
       </w:r>
     </w:p>
     <w:p>
@@ -18193,23 +17249,7 @@
           <w:bCs w:val="0"/>
           <w:lang w:val="vi-VN"/>
         </w:rPr>
-        <w:t>4.</w:t>
-      </w:r>
-      <w:r>
-        <w:rPr>
-          <w:rFonts w:cs="Times New Roman"/>
-          <w:bCs w:val="0"/>
-          <w:lang w:val="vi-VN"/>
-        </w:rPr>
-        <w:t>4</w:t>
-      </w:r>
-      <w:r>
-        <w:rPr>
-          <w:rFonts w:cs="Times New Roman"/>
-          <w:bCs w:val="0"/>
-          <w:lang w:val="vi-VN"/>
-        </w:rPr>
-        <w:t xml:space="preserve">. </w:t>
+        <w:t xml:space="preserve">4.4. </w:t>
       </w:r>
       <w:r>
         <w:rPr>
@@ -18237,39 +17277,7 @@
           <w:bCs w:val="0"/>
           <w:lang w:val="vi-VN"/>
         </w:rPr>
-        <w:t>4.</w:t>
-      </w:r>
-      <w:r>
-        <w:rPr>
-          <w:rFonts w:cs="Times New Roman"/>
-          <w:bCs w:val="0"/>
-          <w:lang w:val="vi-VN"/>
-        </w:rPr>
-        <w:t>4</w:t>
-      </w:r>
-      <w:r>
-        <w:rPr>
-          <w:rFonts w:cs="Times New Roman"/>
-          <w:bCs w:val="0"/>
-          <w:lang w:val="vi-VN"/>
-        </w:rPr>
-        <w:t>.</w:t>
-      </w:r>
-      <w:r>
-        <w:rPr>
-          <w:rFonts w:cs="Times New Roman"/>
-          <w:bCs w:val="0"/>
-          <w:lang w:val="vi-VN"/>
-        </w:rPr>
-        <w:t>1</w:t>
-      </w:r>
-      <w:r>
-        <w:rPr>
-          <w:rFonts w:cs="Times New Roman"/>
-          <w:bCs w:val="0"/>
-          <w:lang w:val="vi-VN"/>
-        </w:rPr>
-        <w:t>. Kết quả kết nối WiFi</w:t>
+        <w:t>4.4.1. Kết quả kết nối WiFi</w:t>
       </w:r>
       <w:bookmarkEnd w:id="122"/>
     </w:p>
@@ -18345,23 +17353,7 @@
           <w:bCs w:val="0"/>
           <w:lang w:val="vi-VN"/>
         </w:rPr>
-        <w:t>4.4.</w:t>
-      </w:r>
-      <w:r>
-        <w:rPr>
-          <w:rFonts w:cs="Times New Roman"/>
-          <w:bCs w:val="0"/>
-          <w:lang w:val="vi-VN"/>
-        </w:rPr>
-        <w:t>2</w:t>
-      </w:r>
-      <w:r>
-        <w:rPr>
-          <w:rFonts w:cs="Times New Roman"/>
-          <w:bCs w:val="0"/>
-          <w:lang w:val="vi-VN"/>
-        </w:rPr>
-        <w:t>. Kết quả truyền dữ liệu MQTT</w:t>
+        <w:t>4.4.2. Kết quả truyền dữ liệu MQTT</w:t>
       </w:r>
       <w:bookmarkEnd w:id="123"/>
     </w:p>
@@ -18437,23 +17429,7 @@
           <w:bCs w:val="0"/>
           <w:lang w:val="vi-VN"/>
         </w:rPr>
-        <w:t>4.4.</w:t>
-      </w:r>
-      <w:r>
-        <w:rPr>
-          <w:rFonts w:cs="Times New Roman"/>
-          <w:bCs w:val="0"/>
-          <w:lang w:val="vi-VN"/>
-        </w:rPr>
-        <w:t>3</w:t>
-      </w:r>
-      <w:r>
-        <w:rPr>
-          <w:rFonts w:cs="Times New Roman"/>
-          <w:bCs w:val="0"/>
-          <w:lang w:val="vi-VN"/>
-        </w:rPr>
-        <w:t>. Kết quả gửi cảnh báo Telegram</w:t>
+        <w:t>4.4.3. Kết quả gửi cảnh báo Telegram</w:t>
       </w:r>
       <w:bookmarkEnd w:id="124"/>
     </w:p>
@@ -18526,23 +17502,7 @@
           <w:bCs w:val="0"/>
           <w:lang w:val="vi-VN"/>
         </w:rPr>
-        <w:t>4.</w:t>
-      </w:r>
-      <w:r>
-        <w:rPr>
-          <w:rFonts w:cs="Times New Roman"/>
-          <w:bCs w:val="0"/>
-          <w:lang w:val="vi-VN"/>
-        </w:rPr>
-        <w:t>5</w:t>
-      </w:r>
-      <w:r>
-        <w:rPr>
-          <w:rFonts w:cs="Times New Roman"/>
-          <w:bCs w:val="0"/>
-          <w:lang w:val="vi-VN"/>
-        </w:rPr>
-        <w:t xml:space="preserve">. </w:t>
+        <w:t xml:space="preserve">4.5. </w:t>
       </w:r>
       <w:r>
         <w:rPr>
@@ -18570,39 +17530,7 @@
           <w:bCs w:val="0"/>
           <w:lang w:val="vi-VN"/>
         </w:rPr>
-        <w:t>4.</w:t>
-      </w:r>
-      <w:r>
-        <w:rPr>
-          <w:rFonts w:cs="Times New Roman"/>
-          <w:bCs w:val="0"/>
-          <w:lang w:val="vi-VN"/>
-        </w:rPr>
-        <w:t>5</w:t>
-      </w:r>
-      <w:r>
-        <w:rPr>
-          <w:rFonts w:cs="Times New Roman"/>
-          <w:bCs w:val="0"/>
-          <w:lang w:val="vi-VN"/>
-        </w:rPr>
-        <w:t>.</w:t>
-      </w:r>
-      <w:r>
-        <w:rPr>
-          <w:rFonts w:cs="Times New Roman"/>
-          <w:bCs w:val="0"/>
-          <w:lang w:val="vi-VN"/>
-        </w:rPr>
-        <w:t>1</w:t>
-      </w:r>
-      <w:r>
-        <w:rPr>
-          <w:rFonts w:cs="Times New Roman"/>
-          <w:bCs w:val="0"/>
-          <w:lang w:val="vi-VN"/>
-        </w:rPr>
-        <w:t>. Ưu điểm</w:t>
+        <w:t>4.5.1. Ưu điểm</w:t>
       </w:r>
       <w:bookmarkEnd w:id="126"/>
     </w:p>
@@ -18715,23 +17643,7 @@
           <w:lang w:val="vi-VN"/>
         </w:rPr>
         <w:lastRenderedPageBreak/>
-        <w:t>4.5.</w:t>
-      </w:r>
-      <w:r>
-        <w:rPr>
-          <w:rFonts w:cs="Times New Roman"/>
-          <w:bCs w:val="0"/>
-          <w:lang w:val="vi-VN"/>
-        </w:rPr>
-        <w:t>2</w:t>
-      </w:r>
-      <w:r>
-        <w:rPr>
-          <w:rFonts w:cs="Times New Roman"/>
-          <w:bCs w:val="0"/>
-          <w:lang w:val="vi-VN"/>
-        </w:rPr>
-        <w:t>. Nhược điểm</w:t>
+        <w:t>4.5.2. Nhược điểm</w:t>
       </w:r>
       <w:bookmarkEnd w:id="127"/>
     </w:p>
@@ -18822,23 +17734,7 @@
           <w:bCs w:val="0"/>
           <w:lang w:val="vi-VN"/>
         </w:rPr>
-        <w:t>4</w:t>
-      </w:r>
-      <w:r>
-        <w:rPr>
-          <w:rFonts w:cs="Times New Roman"/>
-          <w:bCs w:val="0"/>
-          <w:lang w:val="vi-VN"/>
-        </w:rPr>
-        <w:t>.6</w:t>
-      </w:r>
-      <w:r>
-        <w:rPr>
-          <w:rFonts w:cs="Times New Roman"/>
-          <w:bCs w:val="0"/>
-          <w:lang w:val="vi-VN"/>
-        </w:rPr>
-        <w:t xml:space="preserve">. </w:t>
+        <w:t xml:space="preserve">4.6. </w:t>
       </w:r>
       <w:r>
         <w:rPr>
@@ -19058,15 +17954,7 @@
           <w:bCs w:val="0"/>
           <w:lang w:val="vi-VN"/>
         </w:rPr>
-        <w:t>5</w:t>
-      </w:r>
-      <w:r>
-        <w:rPr>
-          <w:rFonts w:cs="Times New Roman"/>
-          <w:bCs w:val="0"/>
-          <w:lang w:val="vi-VN"/>
-        </w:rPr>
-        <w:t xml:space="preserve">.1. </w:t>
+        <w:t xml:space="preserve">5.1. </w:t>
       </w:r>
       <w:r>
         <w:rPr>
@@ -19269,15 +18157,7 @@
           <w:bCs w:val="0"/>
           <w:lang w:val="vi-VN"/>
         </w:rPr>
-        <w:t>5</w:t>
-      </w:r>
-      <w:r>
-        <w:rPr>
-          <w:rFonts w:cs="Times New Roman"/>
-          <w:bCs w:val="0"/>
-          <w:lang w:val="vi-VN"/>
-        </w:rPr>
-        <w:t xml:space="preserve">.2. </w:t>
+        <w:t xml:space="preserve">5.2. </w:t>
       </w:r>
       <w:r>
         <w:rPr>
@@ -19404,23 +18284,7 @@
           <w:bCs w:val="0"/>
           <w:lang w:val="vi-VN"/>
         </w:rPr>
-        <w:t>5.</w:t>
-      </w:r>
-      <w:r>
-        <w:rPr>
-          <w:rFonts w:cs="Times New Roman"/>
-          <w:bCs w:val="0"/>
-          <w:lang w:val="vi-VN"/>
-        </w:rPr>
-        <w:t>3</w:t>
-      </w:r>
-      <w:r>
-        <w:rPr>
-          <w:rFonts w:cs="Times New Roman"/>
-          <w:bCs w:val="0"/>
-          <w:lang w:val="vi-VN"/>
-        </w:rPr>
-        <w:t xml:space="preserve">. </w:t>
+        <w:t xml:space="preserve">5.3. </w:t>
       </w:r>
       <w:r>
         <w:rPr>
@@ -19564,23 +18428,7 @@
           <w:bCs w:val="0"/>
           <w:lang w:val="vi-VN"/>
         </w:rPr>
-        <w:t>5.</w:t>
-      </w:r>
-      <w:r>
-        <w:rPr>
-          <w:rFonts w:cs="Times New Roman"/>
-          <w:bCs w:val="0"/>
-          <w:lang w:val="vi-VN"/>
-        </w:rPr>
-        <w:t>4</w:t>
-      </w:r>
-      <w:r>
-        <w:rPr>
-          <w:rFonts w:cs="Times New Roman"/>
-          <w:bCs w:val="0"/>
-          <w:lang w:val="vi-VN"/>
-        </w:rPr>
-        <w:t xml:space="preserve">. </w:t>
+        <w:t xml:space="preserve">5.4. </w:t>
       </w:r>
       <w:r>
         <w:rPr>
@@ -19818,23 +18666,7 @@
           <w:bCs w:val="0"/>
           <w:lang w:val="vi-VN"/>
         </w:rPr>
-        <w:t>5.</w:t>
-      </w:r>
-      <w:r>
-        <w:rPr>
-          <w:rFonts w:cs="Times New Roman"/>
-          <w:bCs w:val="0"/>
-          <w:lang w:val="vi-VN"/>
-        </w:rPr>
-        <w:t>5</w:t>
-      </w:r>
-      <w:r>
-        <w:rPr>
-          <w:rFonts w:cs="Times New Roman"/>
-          <w:bCs w:val="0"/>
-          <w:lang w:val="vi-VN"/>
-        </w:rPr>
-        <w:t xml:space="preserve">. </w:t>
+        <w:t xml:space="preserve">5.5. </w:t>
       </w:r>
       <w:r>
         <w:rPr>
@@ -29169,6 +28001,7 @@
   <w:style w:type="character" w:default="1" w:styleId="DefaultParagraphFont">
     <w:name w:val="Default Paragraph Font"/>
     <w:uiPriority w:val="1"/>
+    <w:semiHidden/>
     <w:unhideWhenUsed/>
   </w:style>
   <w:style w:type="table" w:default="1" w:styleId="TableNormal">
@@ -29359,6 +28192,7 @@
       <w:numPr>
         <w:ilvl w:val="1"/>
       </w:numPr>
+      <w:ind w:firstLine="567"/>
     </w:pPr>
     <w:rPr>
       <w:rFonts w:asciiTheme="minorHAnsi" w:eastAsiaTheme="majorEastAsia" w:hAnsiTheme="minorHAnsi" w:cstheme="majorBidi"/>

</xml_diff>